<commit_message>
Fill in project brief: summary, questions to resolve, optional directions
Same text as docs/project_brief.md; section 14 left for the mentor.

Co-Authored-By: Claude Opus 5.5 <noreply@anthropic.com>
</commit_message>
<xml_diff>
--- a/Medication scenario.docx
+++ b/Medication scenario.docx
@@ -378,7 +378,7 @@
               <w:rPr>
                 <w:sz w:val="18"/>
               </w:rPr>
-              <w:t>Health appointment project</w:t>
+              <w:t xml:space="preserve">A machine learning model that predicts each outpatient appointment's no-show risk before it happens, so clinic staff can focus reminders and follow-up calls on the appointments most likely to be missed.</w:t>
             </w:r>
           </w:p>
         </w:tc>
@@ -2158,32 +2158,128 @@
             <w:vAlign w:val="center"/>
           </w:tcPr>
           <w:p>
+            <w:pPr>
+              <w:spacing w:after="80"/>
+              <w:ind w:left="284" w:hanging="284"/>
+            </w:pPr>
             <w:r>
               <w:rPr>
                 <w:sz w:val="18"/>
               </w:rPr>
-              <w:t>1.</w:t>
+              <w:t xml:space="preserve">1.	</w:t>
+            </w:r>
+            <w:r>
+              <w:rPr>
+                <w:b/>
+                <w:sz w:val="18"/>
+              </w:rPr>
+              <w:t xml:space="preserve">When is the prediction made, and is SMS_received known at that moment? </w:t>
             </w:r>
             <w:r>
               <w:rPr>
                 <w:sz w:val="18"/>
               </w:rPr>
-              <w:br/>
-              <w:t>2.</w:t>
+              <w:t xml:space="preserve">SMS reminders are sent after booking (only for appointments booked 3 or more days ahead). If the model scores appointments at booking time, SMS status is not yet known and must be excluded; if it scores them the day before the appointment, SMS status can be used. The prediction moment must be fixed first, because it decides which features are legal.</w:t>
+            </w:r>
+          </w:p>
+          <w:p>
+            <w:pPr>
+              <w:spacing w:after="80"/>
+              <w:ind w:left="284" w:hanging="284"/>
+            </w:pPr>
+            <w:r>
+              <w:rPr>
+                <w:sz w:val="18"/>
+              </w:rPr>
+              <w:t xml:space="preserve">2.	</w:t>
+            </w:r>
+            <w:r>
+              <w:rPr>
+                <w:b/>
+                <w:sz w:val="18"/>
+              </w:rPr>
+              <w:t xml:space="preserve">How can patient history be used without leakage, and what happens for new patients? </w:t>
             </w:r>
             <w:r>
               <w:rPr>
                 <w:sz w:val="18"/>
               </w:rPr>
-              <w:br/>
-              <w:t>3.</w:t>
+              <w:t xml:space="preserve">A patient's past no-shows are only known once those appointments have happened, so history features may only count appointments dated before the current booking's ScheduledDay. Patients with no history need a sensible default (e.g. "0 prior appointments") rather than a missing value.</w:t>
+            </w:r>
+          </w:p>
+          <w:p>
+            <w:pPr>
+              <w:spacing w:after="80"/>
+              <w:ind w:left="284" w:hanging="284"/>
+            </w:pPr>
+            <w:r>
+              <w:rPr>
+                <w:sz w:val="18"/>
+              </w:rPr>
+              <w:t xml:space="preserve">3.	</w:t>
+            </w:r>
+            <w:r>
+              <w:rPr>
+                <w:b/>
+                <w:sz w:val="18"/>
+              </w:rPr>
+              <w:t xml:space="preserve">How should the data be split in time? </w:t>
             </w:r>
             <w:r>
               <w:rPr>
                 <w:sz w:val="18"/>
               </w:rPr>
-              <w:br/>
-              <w:t>4.</w:t>
+              <w:t xml:space="preserve">Appointment dates only cover about 6 weeks (2016-04-29 to 2016-06-08). The split must keep training, validation, and test periods in chronological order and still leave enough no-shows in each period to measure performance reliably.</w:t>
+            </w:r>
+          </w:p>
+          <w:p>
+            <w:pPr>
+              <w:spacing w:after="80"/>
+              <w:ind w:left="284" w:hanging="284"/>
+            </w:pPr>
+            <w:r>
+              <w:rPr>
+                <w:sz w:val="18"/>
+              </w:rPr>
+              <w:t xml:space="preserve">4.	</w:t>
+            </w:r>
+            <w:r>
+              <w:rPr>
+                <w:b/>
+                <w:sz w:val="18"/>
+              </w:rPr>
+              <w:t xml:space="preserve">What operating threshold matches staff capacity? </w:t>
+            </w:r>
+            <w:r>
+              <w:rPr>
+                <w:sz w:val="18"/>
+              </w:rPr>
+              <w:t xml:space="preserve">Staff can only call a limited number of patients per day. The threshold that turns probabilities into Low/Medium/High bands should be chosen from the precision/recall trade-off at a realistic follow-up capacity (e.g. the top 10–20% riskiest appointments), not left at the default 0.5.</w:t>
+            </w:r>
+          </w:p>
+          <w:p>
+            <w:pPr>
+              <w:spacing w:after="80"/>
+              <w:ind w:left="284" w:hanging="284"/>
+            </w:pPr>
+            <w:r>
+              <w:rPr>
+                <w:sz w:val="18"/>
+              </w:rPr>
+              <w:t xml:space="preserve">5.	</w:t>
+            </w:r>
+            <w:r>
+              <w:rPr>
+                <w:b/>
+                <w:sz w:val="18"/>
+              </w:rPr>
+              <w:t xml:space="preserve">Does the model perform equally well across patient groups? </w:t>
+            </w:r>
+            <w:r>
+              <w:rPr>
+                <w:sz w:val="18"/>
+              </w:rPr>
+              <w:t xml:space="preserve">Performance must be compared by gender, age group, neighbourhood, and welfare (Scholarship) status, so that the tool does not systematically miss or over-flag particular groups.</w:t>
             </w:r>
           </w:p>
         </w:tc>
@@ -2209,16 +2305,33 @@
       </w:r>
     </w:p>
     <w:p>
+      <w:pPr>
+        <w:spacing w:after="60"/>
+        <w:ind w:left="284" w:hanging="284"/>
+      </w:pPr>
       <w:r>
-        <w:t>• ______________________________________________</w:t>
+        <w:rPr/>
+        <w:t xml:space="preserve">•	A simple staff-facing web app (e.g. Gradio or Streamlit) that shows a day's appointments ranked by risk.</w:t>
       </w:r>
+    </w:p>
+    <w:p>
+      <w:pPr>
+        <w:spacing w:after="60"/>
+        <w:ind w:left="284" w:hanging="284"/>
+      </w:pPr>
       <w:r>
-        <w:br/>
-        <w:t>• ______________________________________________</w:t>
+        <w:rPr/>
+        <w:t xml:space="preserve">•	Per-prediction explanations (e.g. SHAP or feature contributions), so staff can see why an appointment was flagged.</w:t>
       </w:r>
+    </w:p>
+    <w:p>
+      <w:pPr>
+        <w:spacing w:after="60"/>
+        <w:ind w:left="284" w:hanging="284"/>
+      </w:pPr>
       <w:r>
-        <w:br/>
-        <w:t>• ______________________________________________</w:t>
+        <w:rPr/>
+        <w:t xml:space="preserve">•	A cost-based threshold that weighs the cost of an empty slot against the cost of a reminder call, plus probability calibration.</w:t>
       </w:r>
     </w:p>
     <w:p>

</xml_diff>

<commit_message>
Brief: state that SMS status is excluded (not known at booking time)
Updated in both the Word brief and docs/project_brief.md so the brief matches the final design.

Co-Authored-By: Claude Opus 5.5 <noreply@anthropic.com>
</commit_message>
<xml_diff>
--- a/Medication scenario.docx
+++ b/Medication scenario.docx
@@ -871,7 +871,7 @@
               <w:rPr>
                 <w:sz w:val="18"/>
               </w:rPr>
-              <w:t>, scholarship status, health conditions), scheduling dates and days of advance notice, and SMS reminder status</w:t>
+              <w:t>, scholarship status, health conditions), scheduling dates and days of advance notice, and the patient's attendance history known at booking time. SMS reminder status is excluded: reminders are sent after booking, so it is not known when the prediction is made</w:t>
             </w:r>
           </w:p>
         </w:tc>
@@ -1457,7 +1457,7 @@
               <w:rPr>
                 <w:sz w:val="18"/>
               </w:rPr>
-              <w:t>The details of one new scheduled appointment (patient demographics, health flags, scheduling/appointment dates, reminder status) before it happens</w:t>
+              <w:t>The details of one new scheduled appointment (patient demographics, health flags, scheduling/appointment dates, and past attendance known at booking time) before it happens; SMS reminder status is not used</w:t>
             </w:r>
           </w:p>
         </w:tc>
@@ -1553,7 +1553,7 @@
               <w:rPr>
                 <w:sz w:val="18"/>
               </w:rPr>
-              <w:t>Assumes the historical Brazilian clinic data generalizes to the client's own patients, and that features like SMS timing and patient history stay truly "before the appointment" with no accidental leakage</w:t>
+              <w:t>Assumes the historical Brazilian clinic data generalizes to the client's own patients, and that every feature, especially patient history, is truly known at booking time, with no accidental leakage</w:t>
             </w:r>
           </w:p>
         </w:tc>

</xml_diff>